<commit_message>
Change brand color from teal to pink
- Update brand palette: primary #087581 -> #BE185D, secondary #13CDCD -> #EC4899
- Update gradients, glow/card shadows, scrollbar, and theme-color meta
- Regenerate resume PDF and DOCX with pink headings

Co-Authored-By: Claude Opus 4.8 <noreply@anthropic.com>
Claude-Session: https://claude.ai/code/session_018WhfC4qi2RVp1EPepU4zFx
</commit_message>
<xml_diff>
--- a/public/Rhealyn-Villar-Resume.docx
+++ b/public/Rhealyn-Villar-Resume.docx
@@ -25,7 +25,7 @@
         <w:rPr>
           <w:b/>
           <w:bCs/>
-          <w:color w:val="087581"/>
+          <w:color w:val="BE185D"/>
           <w:sz w:val="21"/>
           <w:szCs w:val="21"/>
         </w:rPr>
@@ -64,7 +64,7 @@
     <w:p>
       <w:pPr>
         <w:pBdr>
-          <w:bottom w:val="single" w:color="087581" w:sz="12" w:space="2"/>
+          <w:bottom w:val="single" w:color="BE185D" w:sz="12" w:space="2"/>
         </w:pBdr>
         <w:spacing w:after="90" w:before="220"/>
       </w:pPr>
@@ -72,7 +72,7 @@
         <w:rPr>
           <w:b/>
           <w:bCs/>
-          <w:color w:val="087581"/>
+          <w:color w:val="BE185D"/>
           <w:spacing w:val="30"/>
           <w:sz w:val="21"/>
           <w:szCs w:val="21"/>
@@ -95,7 +95,7 @@
     <w:p>
       <w:pPr>
         <w:pBdr>
-          <w:bottom w:val="single" w:color="087581" w:sz="12" w:space="2"/>
+          <w:bottom w:val="single" w:color="BE185D" w:sz="12" w:space="2"/>
         </w:pBdr>
         <w:spacing w:after="90" w:before="220"/>
       </w:pPr>
@@ -103,7 +103,7 @@
         <w:rPr>
           <w:b/>
           <w:bCs/>
-          <w:color w:val="087581"/>
+          <w:color w:val="BE185D"/>
           <w:spacing w:val="30"/>
           <w:sz w:val="21"/>
           <w:szCs w:val="21"/>
@@ -699,7 +699,7 @@
     <w:p>
       <w:pPr>
         <w:pBdr>
-          <w:bottom w:val="single" w:color="087581" w:sz="12" w:space="2"/>
+          <w:bottom w:val="single" w:color="BE185D" w:sz="12" w:space="2"/>
         </w:pBdr>
         <w:spacing w:after="90" w:before="220"/>
       </w:pPr>
@@ -707,7 +707,7 @@
         <w:rPr>
           <w:b/>
           <w:bCs/>
-          <w:color w:val="087581"/>
+          <w:color w:val="BE185D"/>
           <w:spacing w:val="30"/>
           <w:sz w:val="21"/>
           <w:szCs w:val="21"/>
@@ -950,7 +950,7 @@
     <w:p>
       <w:pPr>
         <w:pBdr>
-          <w:bottom w:val="single" w:color="087581" w:sz="12" w:space="2"/>
+          <w:bottom w:val="single" w:color="BE185D" w:sz="12" w:space="2"/>
         </w:pBdr>
         <w:spacing w:after="90" w:before="220"/>
       </w:pPr>
@@ -958,7 +958,7 @@
         <w:rPr>
           <w:b/>
           <w:bCs/>
-          <w:color w:val="087581"/>
+          <w:color w:val="BE185D"/>
           <w:spacing w:val="30"/>
           <w:sz w:val="21"/>
           <w:szCs w:val="21"/>
@@ -1003,7 +1003,7 @@
     <w:p>
       <w:pPr>
         <w:pBdr>
-          <w:bottom w:val="single" w:color="087581" w:sz="12" w:space="2"/>
+          <w:bottom w:val="single" w:color="BE185D" w:sz="12" w:space="2"/>
         </w:pBdr>
         <w:spacing w:after="90" w:before="220"/>
       </w:pPr>
@@ -1011,7 +1011,7 @@
         <w:rPr>
           <w:b/>
           <w:bCs/>
-          <w:color w:val="087581"/>
+          <w:color w:val="BE185D"/>
           <w:spacing w:val="30"/>
           <w:sz w:val="21"/>
           <w:szCs w:val="21"/>
@@ -1132,7 +1132,7 @@
     <w:p>
       <w:pPr>
         <w:pBdr>
-          <w:bottom w:val="single" w:color="087581" w:sz="12" w:space="2"/>
+          <w:bottom w:val="single" w:color="BE185D" w:sz="12" w:space="2"/>
         </w:pBdr>
         <w:spacing w:after="90" w:before="220"/>
       </w:pPr>
@@ -1140,7 +1140,7 @@
         <w:rPr>
           <w:b/>
           <w:bCs/>
-          <w:color w:val="087581"/>
+          <w:color w:val="BE185D"/>
           <w:spacing w:val="30"/>
           <w:sz w:val="21"/>
           <w:szCs w:val="21"/>
@@ -1163,7 +1163,7 @@
     <w:p>
       <w:pPr>
         <w:pBdr>
-          <w:bottom w:val="single" w:color="087581" w:sz="12" w:space="2"/>
+          <w:bottom w:val="single" w:color="BE185D" w:sz="12" w:space="2"/>
         </w:pBdr>
         <w:spacing w:after="90" w:before="220"/>
       </w:pPr>
@@ -1171,7 +1171,7 @@
         <w:rPr>
           <w:b/>
           <w:bCs/>
-          <w:color w:val="087581"/>
+          <w:color w:val="BE185D"/>
           <w:spacing w:val="30"/>
           <w:sz w:val="21"/>
           <w:szCs w:val="21"/>
@@ -1216,7 +1216,7 @@
     <w:p>
       <w:pPr>
         <w:pBdr>
-          <w:bottom w:val="single" w:color="087581" w:sz="12" w:space="2"/>
+          <w:bottom w:val="single" w:color="BE185D" w:sz="12" w:space="2"/>
         </w:pBdr>
         <w:spacing w:after="90" w:before="220"/>
       </w:pPr>
@@ -1224,7 +1224,7 @@
         <w:rPr>
           <w:b/>
           <w:bCs/>
-          <w:color w:val="087581"/>
+          <w:color w:val="BE185D"/>
           <w:spacing w:val="30"/>
           <w:sz w:val="21"/>
           <w:szCs w:val="21"/>

</xml_diff>